<commit_message>
Docs refresh: streaming in plan/workflow, current recall in README, latest stream run in report/page/docx
- README: post-IMD-refinement recall (86 % / 88 %), streaming summary line
- implementation_plan.md §15: streaming extension marked implemented (file source instead of Kafka)
- project_workflow.md: streaming demo / summary commands
- results: user's 2024-heatwave stream run (parity OK), summary.csv, report, page, docx regenerated

Co-Authored-By: Claude Opus 5.5 <noreply@anthropic.com>
</commit_message>
<xml_diff>
--- a/docs/Implementation_Phases.docx
+++ b/docs/Implementation_Phases.docx
@@ -15283,6 +15283,182 @@
                 <w:szCs w:val="19"/>
               </w:rPr>
               <w:t xml:space="preserve">2.3 s / 2.5 s</w:t>
+            </w:r>
+          </w:p>
+        </w:tc>
+        <w:tc>
+          <w:tcPr>
+            <w:tcW w:type="dxa" w:w="1126"/>
+            <w:tcBorders>
+              <w:top w:val="single" w:color="C9D2DB" w:sz="4"/>
+              <w:left w:val="single" w:color="C9D2DB" w:sz="4"/>
+              <w:bottom w:val="single" w:color="C9D2DB" w:sz="4"/>
+              <w:right w:val="single" w:color="C9D2DB" w:sz="4"/>
+            </w:tcBorders>
+            <w:tcMar>
+              <w:top w:type="dxa" w:w="70"/>
+              <w:left w:type="dxa" w:w="110"/>
+              <w:bottom w:type="dxa" w:w="70"/>
+              <w:right w:type="dxa" w:w="110"/>
+            </w:tcMar>
+          </w:tcPr>
+          <w:p>
+            <w:pPr>
+              <w:spacing w:after="0" w:line="260"/>
+            </w:pPr>
+            <w:r>
+              <w:rPr>
+                <w:sz w:val="19"/>
+                <w:szCs w:val="19"/>
+              </w:rPr>
+              <w:t xml:space="preserve">101 / 101</w:t>
+            </w:r>
+          </w:p>
+        </w:tc>
+      </w:tr>
+      <w:tr>
+        <w:tc>
+          <w:tcPr>
+            <w:tcW w:type="dxa" w:w="2900"/>
+            <w:tcBorders>
+              <w:top w:val="single" w:color="C9D2DB" w:sz="4"/>
+              <w:left w:val="single" w:color="C9D2DB" w:sz="4"/>
+              <w:bottom w:val="single" w:color="C9D2DB" w:sz="4"/>
+              <w:right w:val="single" w:color="C9D2DB" w:sz="4"/>
+            </w:tcBorders>
+            <w:tcMar>
+              <w:top w:type="dxa" w:w="70"/>
+              <w:left w:type="dxa" w:w="110"/>
+              <w:bottom w:type="dxa" w:w="70"/>
+              <w:right w:type="dxa" w:w="110"/>
+            </w:tcMar>
+          </w:tcPr>
+          <w:p>
+            <w:pPr>
+              <w:spacing w:after="0" w:line="260"/>
+            </w:pPr>
+            <w:r>
+              <w:rPr>
+                <w:sz w:val="19"/>
+                <w:szCs w:val="19"/>
+              </w:rPr>
+              <w:t xml:space="preserve">2024 heatwave</w:t>
+            </w:r>
+          </w:p>
+        </w:tc>
+        <w:tc>
+          <w:tcPr>
+            <w:tcW w:type="dxa" w:w="1500"/>
+            <w:tcBorders>
+              <w:top w:val="single" w:color="C9D2DB" w:sz="4"/>
+              <w:left w:val="single" w:color="C9D2DB" w:sz="4"/>
+              <w:bottom w:val="single" w:color="C9D2DB" w:sz="4"/>
+              <w:right w:val="single" w:color="C9D2DB" w:sz="4"/>
+            </w:tcBorders>
+            <w:tcMar>
+              <w:top w:type="dxa" w:w="70"/>
+              <w:left w:type="dxa" w:w="110"/>
+              <w:bottom w:type="dxa" w:w="70"/>
+              <w:right w:type="dxa" w:w="110"/>
+            </w:tcMar>
+          </w:tcPr>
+          <w:p>
+            <w:pPr>
+              <w:spacing w:after="0" w:line="260"/>
+            </w:pPr>
+            <w:r>
+              <w:rPr>
+                <w:sz w:val="19"/>
+                <w:szCs w:val="19"/>
+              </w:rPr>
+              <w:t xml:space="preserve">local[4]</w:t>
+            </w:r>
+          </w:p>
+        </w:tc>
+        <w:tc>
+          <w:tcPr>
+            <w:tcW w:type="dxa" w:w="1050"/>
+            <w:tcBorders>
+              <w:top w:val="single" w:color="C9D2DB" w:sz="4"/>
+              <w:left w:val="single" w:color="C9D2DB" w:sz="4"/>
+              <w:bottom w:val="single" w:color="C9D2DB" w:sz="4"/>
+              <w:right w:val="single" w:color="C9D2DB" w:sz="4"/>
+            </w:tcBorders>
+            <w:tcMar>
+              <w:top w:type="dxa" w:w="70"/>
+              <w:left w:type="dxa" w:w="110"/>
+              <w:bottom w:type="dxa" w:w="70"/>
+              <w:right w:type="dxa" w:w="110"/>
+            </w:tcMar>
+          </w:tcPr>
+          <w:p>
+            <w:pPr>
+              <w:spacing w:after="0" w:line="260"/>
+            </w:pPr>
+            <w:r>
+              <w:rPr>
+                <w:sz w:val="19"/>
+                <w:szCs w:val="19"/>
+              </w:rPr>
+              <w:t xml:space="preserve">8,784</w:t>
+            </w:r>
+          </w:p>
+        </w:tc>
+        <w:tc>
+          <w:tcPr>
+            <w:tcW w:type="dxa" w:w="850"/>
+            <w:tcBorders>
+              <w:top w:val="single" w:color="C9D2DB" w:sz="4"/>
+              <w:left w:val="single" w:color="C9D2DB" w:sz="4"/>
+              <w:bottom w:val="single" w:color="C9D2DB" w:sz="4"/>
+              <w:right w:val="single" w:color="C9D2DB" w:sz="4"/>
+            </w:tcBorders>
+            <w:tcMar>
+              <w:top w:type="dxa" w:w="70"/>
+              <w:left w:type="dxa" w:w="110"/>
+              <w:bottom w:type="dxa" w:w="70"/>
+              <w:right w:type="dxa" w:w="110"/>
+            </w:tcMar>
+          </w:tcPr>
+          <w:p>
+            <w:pPr>
+              <w:spacing w:after="0" w:line="260"/>
+            </w:pPr>
+            <w:r>
+              <w:rPr>
+                <w:sz w:val="19"/>
+                <w:szCs w:val="19"/>
+              </w:rPr>
+              <w:t xml:space="preserve">232</w:t>
+            </w:r>
+          </w:p>
+        </w:tc>
+        <w:tc>
+          <w:tcPr>
+            <w:tcW w:type="dxa" w:w="1600"/>
+            <w:tcBorders>
+              <w:top w:val="single" w:color="C9D2DB" w:sz="4"/>
+              <w:left w:val="single" w:color="C9D2DB" w:sz="4"/>
+              <w:bottom w:val="single" w:color="C9D2DB" w:sz="4"/>
+              <w:right w:val="single" w:color="C9D2DB" w:sz="4"/>
+            </w:tcBorders>
+            <w:tcMar>
+              <w:top w:type="dxa" w:w="70"/>
+              <w:left w:type="dxa" w:w="110"/>
+              <w:bottom w:type="dxa" w:w="70"/>
+              <w:right w:type="dxa" w:w="110"/>
+            </w:tcMar>
+          </w:tcPr>
+          <w:p>
+            <w:pPr>
+              <w:spacing w:after="0" w:line="260"/>
+            </w:pPr>
+            <w:r>
+              <w:rPr>
+                <w:sz w:val="19"/>
+                <w:szCs w:val="19"/>
+              </w:rPr>
+              <w:t xml:space="preserve">2.5 s / 2.6 s</w:t>
             </w:r>
           </w:p>
         </w:tc>

</xml_diff>